<commit_message>
docs: add vercel deployment and github repo links to report docx
</commit_message>
<xml_diff>
--- a/Green_Computing_and_Software_Engineering_ProdZ.docx
+++ b/Green_Computing_and_Software_Engineering_ProdZ.docx
@@ -19,7 +19,7 @@
     </w:p>
     <w:p>
       <w:pPr>
-        <w:spacing w:before="0" w:after="400"/>
+        <w:spacing w:before="0" w:after="200"/>
         <w:jc w:val="center"/>
       </w:pPr>
       <w:r>
@@ -31,6 +31,114 @@
         </w:rPr>
         <w:t>A Formal Examination of Green Software Engineering Principles and Implementation Practices</w:t>
       </w:r>
+    </w:p>
+    <w:tbl>
+      <w:tblPr>
+        <w:tblW w:type="auto" w:w="0"/>
+        <w:jc w:val="center"/>
+        <w:tblLook w:firstColumn="1" w:firstRow="1" w:lastColumn="0" w:lastRow="0" w:noHBand="0" w:noVBand="1" w:val="04A0"/>
+        <w:tblBorders>
+          <w:top w:val="single" w:sz="4" w:space="0" w:color="000000"/>
+          <w:left w:val="single" w:sz="4" w:space="0" w:color="000000"/>
+          <w:bottom w:val="single" w:sz="4" w:space="0" w:color="000000"/>
+          <w:right w:val="single" w:sz="4" w:space="0" w:color="000000"/>
+          <w:insideH w:val="single" w:sz="4" w:space="0" w:color="000000"/>
+          <w:insideV w:val="none"/>
+        </w:tblBorders>
+      </w:tblPr>
+      <w:tblGrid>
+        <w:gridCol w:w="4680"/>
+        <w:gridCol w:w="4680"/>
+      </w:tblGrid>
+      <w:tr>
+        <w:tc>
+          <w:tcPr>
+            <w:tcW w:type="dxa" w:w="3168"/>
+          </w:tcPr>
+          <w:p>
+            <w:pPr>
+              <w:spacing w:before="40" w:after="40"/>
+            </w:pPr>
+            <w:r>
+              <w:rPr>
+                <w:rFonts w:ascii="Calibri" w:hAnsi="Calibri"/>
+                <w:b/>
+                <w:color w:val="000000"/>
+                <w:sz w:val="19"/>
+              </w:rPr>
+              <w:t>Live Application URL:</w:t>
+            </w:r>
+          </w:p>
+        </w:tc>
+        <w:tc>
+          <w:tcPr>
+            <w:tcW w:type="dxa" w:w="6192"/>
+          </w:tcPr>
+          <w:p>
+            <w:pPr>
+              <w:spacing w:before="40" w:after="40"/>
+            </w:pPr>
+            <w:hyperlink r:id="rId11">
+              <w:r>
+                <w:rPr>
+                  <w:rFonts w:ascii="Calibri" w:hAnsi="Calibri"/>
+                  <w:color w:val="000000"/>
+                  <w:u w:val="single"/>
+                  <w:sz w:val="19"/>
+                </w:rPr>
+                <w:t>https://prod-z.vercel.app/</w:t>
+              </w:r>
+            </w:hyperlink>
+          </w:p>
+        </w:tc>
+      </w:tr>
+      <w:tr>
+        <w:tc>
+          <w:tcPr>
+            <w:tcW w:type="dxa" w:w="3168"/>
+          </w:tcPr>
+          <w:p>
+            <w:pPr>
+              <w:spacing w:before="40" w:after="40"/>
+            </w:pPr>
+            <w:r>
+              <w:rPr>
+                <w:rFonts w:ascii="Calibri" w:hAnsi="Calibri"/>
+                <w:b/>
+                <w:color w:val="000000"/>
+                <w:sz w:val="19"/>
+              </w:rPr>
+              <w:t>Source Code Repository:</w:t>
+            </w:r>
+          </w:p>
+        </w:tc>
+        <w:tc>
+          <w:tcPr>
+            <w:tcW w:type="dxa" w:w="6192"/>
+          </w:tcPr>
+          <w:p>
+            <w:pPr>
+              <w:spacing w:before="40" w:after="40"/>
+            </w:pPr>
+            <w:hyperlink r:id="rId12">
+              <w:r>
+                <w:rPr>
+                  <w:rFonts w:ascii="Calibri" w:hAnsi="Calibri"/>
+                  <w:color w:val="000000"/>
+                  <w:u w:val="single"/>
+                  <w:sz w:val="19"/>
+                </w:rPr>
+                <w:t>https://github.com/Dhanumithra/prodZ</w:t>
+              </w:r>
+            </w:hyperlink>
+          </w:p>
+        </w:tc>
+      </w:tr>
+    </w:tbl>
+    <w:p>
+      <w:pPr>
+        <w:spacing w:before="0" w:after="240"/>
+      </w:pPr>
     </w:p>
     <w:p>
       <w:pPr>
@@ -496,7 +604,7 @@
           <w:bottom w:val="single" w:sz="6" w:space="0" w:color="000000"/>
           <w:right w:val="single" w:sz="6" w:space="0" w:color="000000"/>
           <w:insideH w:val="single" w:sz="4" w:space="0" w:color="000000"/>
-          <w:insideV w:val="single" w:sz="4" w:space="0" w:color="000000"/>
+          <w:insideV w:val="none"/>
         </w:tblBorders>
       </w:tblPr>
       <w:tblGrid>
@@ -999,7 +1107,7 @@
           <w:color w:val="000000"/>
           <w:sz w:val="26"/>
         </w:rPr>
-        <w:t>6. Conclusion</w:t>
+        <w:t>6. Conclusion and Project Verification</w:t>
       </w:r>
     </w:p>
     <w:p>
@@ -1026,6 +1134,19 @@
           <w:sz w:val="21"/>
         </w:rPr>
         <w:t>As global energy demand continues to rise, the principles demonstrated in ProdZ—local-first data sovereignty, bandwidth minimization, hardware longevity, and algorithmic energy efficiency—will serve as vital benchmarks for the future of green and sustainable computing.</w:t>
+      </w:r>
+    </w:p>
+    <w:p>
+      <w:pPr>
+        <w:spacing w:before="0" w:after="120" w:line="276" w:lineRule="auto"/>
+      </w:pPr>
+      <w:r>
+        <w:rPr>
+          <w:rFonts w:ascii="Calibri" w:hAnsi="Calibri"/>
+          <w:color w:val="000000"/>
+          <w:sz w:val="21"/>
+        </w:rPr>
+        <w:t>The complete production application is deployed and publicly accessible for verification at https://prod-z.vercel.app/ and its open-source codebase is hosted at https://github.com/Dhanumithra/prodZ.</w:t>
       </w:r>
     </w:p>
     <w:sectPr>

</xml_diff>